<commit_message>
Route 4, section 5: when route 4 reads is a Governance Centre choice: 06:00 on the first working day, or the working day and time MAIIC sets
Three governed settings under Data sources (ebanker_direct_read_timing, _working_day, _time), maker-checker like every setting and self-approvable only under UAT mode on a non-production server; the scheduler checks them each minute and reads nothing if they cannot be read. The data access request of 16 October 2026 (section 5, section 6.2 steps 1 and 5) and the engine spec v4 say so. Suite 0 failures, bootstrap 97 checks 0 FAIL.

Co-Authored-By: Claude Opus 5.5 <noreply@anthropic.com>
</commit_message>
<xml_diff>
--- a/docs/bootstrap/queries/Data access request - E-Banker read-only access (route 4) - 16 Oct 2026.docx
+++ b/docs/bootstrap/queries/Data access request - E-Banker read-only access (route 4) - 16 Oct 2026.docx
@@ -6496,7 +6496,7 @@
                 <w:i w:val="0"/>
                 <w:sz w:val="17"/>
               </w:rPr>
-              <w:t>Run once a month, on the first working day after month-end, between 06:00 and 07:00; the overdue table optionally daily</w:t>
+              <w:t>Run once a month, by default at 06:00 on the first working day after month-end; MAIIC can choose another working day and time in the Governance Centre (section 6.2, step 5)</w:t>
             </w:r>
           </w:p>
         </w:tc>
@@ -10100,7 +10100,23 @@
           <w:b w:val="0"/>
           <w:i w:val="0"/>
         </w:rPr>
-        <w:t xml:space="preserve"> once. It puts the 15 route 4 statements and their fingerprints into the register (section 4.2) and changes no figure. The bootstrap database does this for itself each time it is rebuilt.</w:t>
+        <w:t xml:space="preserve"> and </w:t>
+      </w:r>
+      <w:r>
+        <w:rPr>
+          <w:rFonts w:ascii="Consolas" w:hAnsi="Consolas"/>
+          <w:b w:val="0"/>
+          <w:i w:val="0"/>
+          <w:sz w:val="18"/>
+        </w:rPr>
+        <w:t>php artisan db:seed --class=GovernanceSettingsSeeder --force</w:t>
+      </w:r>
+      <w:r>
+        <w:rPr>
+          <w:b w:val="0"/>
+          <w:i w:val="0"/>
+        </w:rPr>
+        <w:t xml:space="preserve"> once. The first puts the 15 route 4 statements and their fingerprints into the register (section 4.2); the second adds the three settings of step 5 at their defaults and leaves every setting MAIIC has already approved as it is. Neither changes any figure. The bootstrap database does this for itself each time it is rebuilt.</w:t>
       </w:r>
     </w:p>
     <w:p>
@@ -10752,7 +10768,7 @@
           <w:b/>
           <w:i w:val="0"/>
         </w:rPr>
-        <w:t>Step 5. Check the schedule.</w:t>
+        <w:t>Step 5. Check the schedule, and choose when route 4 reads.</w:t>
       </w:r>
       <w:r>
         <w:rPr>
@@ -10807,7 +10823,375 @@
           <w:b w:val="0"/>
           <w:i w:val="0"/>
         </w:rPr>
-        <w:t xml:space="preserve"> at 06:00. It runs on the first weekday of each month and reads the month just ended. Until route 4 is the feed route in force (step 10) it is refused and reads nothing. The schedule does not know Malawi's public holidays, so on a holiday it runs all the same. A month can always be read by hand with </w:t>
+        <w:t xml:space="preserve">. It reads the month just ended, once a month, and MAIIC chooses when in the </w:t>
+      </w:r>
+      <w:r>
+        <w:rPr>
+          <w:b/>
+          <w:i w:val="0"/>
+        </w:rPr>
+        <w:t>Governance Centre, Data sources</w:t>
+      </w:r>
+      <w:r>
+        <w:rPr>
+          <w:b w:val="0"/>
+          <w:i w:val="0"/>
+        </w:rPr>
+        <w:t>:</w:t>
+      </w:r>
+    </w:p>
+    <w:tbl>
+      <w:tblPr>
+        <w:tblStyle w:val="TableGrid"/>
+        <w:tblW w:type="auto" w:w="0"/>
+        <w:tblLook w:firstColumn="1" w:firstRow="1" w:lastColumn="0" w:lastRow="0" w:noHBand="0" w:noVBand="1" w:val="04A0"/>
+      </w:tblPr>
+      <w:tblGrid>
+        <w:gridCol w:w="3324"/>
+        <w:gridCol w:w="3324"/>
+        <w:gridCol w:w="3324"/>
+      </w:tblGrid>
+      <w:tr>
+        <w:trPr>
+          <w:cantSplit/>
+          <w:tblHeader/>
+        </w:trPr>
+        <w:tc>
+          <w:tcPr>
+            <w:tcW w:type="dxa" w:w="3324"/>
+            <w:shd w:val="clear" w:color="auto" w:fill="1B2A41"/>
+          </w:tcPr>
+          <w:p>
+            <w:r>
+              <w:rPr>
+                <w:b/>
+                <w:color w:val="FFFFFF"/>
+                <w:sz w:val="17"/>
+              </w:rPr>
+            </w:r>
+            <w:r>
+              <w:rPr>
+                <w:b/>
+                <w:i w:val="0"/>
+                <w:color w:val="FFFFFF"/>
+                <w:sz w:val="17"/>
+              </w:rPr>
+              <w:t>Setting</w:t>
+            </w:r>
+          </w:p>
+        </w:tc>
+        <w:tc>
+          <w:tcPr>
+            <w:tcW w:type="dxa" w:w="3324"/>
+            <w:shd w:val="clear" w:color="auto" w:fill="1B2A41"/>
+          </w:tcPr>
+          <w:p>
+            <w:r>
+              <w:rPr>
+                <w:b/>
+                <w:color w:val="FFFFFF"/>
+                <w:sz w:val="17"/>
+              </w:rPr>
+            </w:r>
+            <w:r>
+              <w:rPr>
+                <w:b/>
+                <w:i w:val="0"/>
+                <w:color w:val="FFFFFF"/>
+                <w:sz w:val="17"/>
+              </w:rPr>
+              <w:t>Options</w:t>
+            </w:r>
+          </w:p>
+        </w:tc>
+        <w:tc>
+          <w:tcPr>
+            <w:tcW w:type="dxa" w:w="3324"/>
+            <w:shd w:val="clear" w:color="auto" w:fill="1B2A41"/>
+          </w:tcPr>
+          <w:p>
+            <w:r>
+              <w:rPr>
+                <w:b/>
+                <w:color w:val="FFFFFF"/>
+                <w:sz w:val="17"/>
+              </w:rPr>
+            </w:r>
+            <w:r>
+              <w:rPr>
+                <w:b/>
+                <w:i w:val="0"/>
+                <w:color w:val="FFFFFF"/>
+                <w:sz w:val="17"/>
+              </w:rPr>
+              <w:t>Default</w:t>
+            </w:r>
+          </w:p>
+        </w:tc>
+      </w:tr>
+      <w:tr>
+        <w:trPr>
+          <w:cantSplit/>
+        </w:trPr>
+        <w:tc>
+          <w:tcPr>
+            <w:tcW w:type="dxa" w:w="3324"/>
+          </w:tcPr>
+          <w:p>
+            <w:r>
+              <w:rPr>
+                <w:b w:val="0"/>
+                <w:sz w:val="17"/>
+              </w:rPr>
+            </w:r>
+            <w:r>
+              <w:rPr>
+                <w:b w:val="0"/>
+                <w:i/>
+                <w:sz w:val="17"/>
+              </w:rPr>
+              <w:t>When route 4 reads E-Banker each month</w:t>
+            </w:r>
+          </w:p>
+        </w:tc>
+        <w:tc>
+          <w:tcPr>
+            <w:tcW w:type="dxa" w:w="3324"/>
+          </w:tcPr>
+          <w:p>
+            <w:r>
+              <w:rPr>
+                <w:b w:val="0"/>
+                <w:sz w:val="17"/>
+              </w:rPr>
+            </w:r>
+            <w:r>
+              <w:rPr>
+                <w:b/>
+                <w:i w:val="0"/>
+                <w:sz w:val="17"/>
+              </w:rPr>
+              <w:t>At 06:00 on the first working day of the month</w:t>
+            </w:r>
+            <w:r>
+              <w:rPr>
+                <w:b w:val="0"/>
+                <w:i w:val="0"/>
+                <w:sz w:val="17"/>
+              </w:rPr>
+              <w:t xml:space="preserve">, or </w:t>
+            </w:r>
+            <w:r>
+              <w:rPr>
+                <w:b/>
+                <w:i w:val="0"/>
+                <w:sz w:val="17"/>
+              </w:rPr>
+              <w:t>On the working day and at the time set below</w:t>
+            </w:r>
+          </w:p>
+        </w:tc>
+        <w:tc>
+          <w:tcPr>
+            <w:tcW w:type="dxa" w:w="3324"/>
+          </w:tcPr>
+          <w:p>
+            <w:r>
+              <w:rPr>
+                <w:b w:val="0"/>
+                <w:sz w:val="17"/>
+              </w:rPr>
+            </w:r>
+            <w:r>
+              <w:rPr>
+                <w:b w:val="0"/>
+                <w:i w:val="0"/>
+                <w:sz w:val="17"/>
+              </w:rPr>
+              <w:t>At 06:00 on the first working day</w:t>
+            </w:r>
+          </w:p>
+        </w:tc>
+      </w:tr>
+      <w:tr>
+        <w:trPr>
+          <w:cantSplit/>
+        </w:trPr>
+        <w:tc>
+          <w:tcPr>
+            <w:tcW w:type="dxa" w:w="3324"/>
+          </w:tcPr>
+          <w:p>
+            <w:r>
+              <w:rPr>
+                <w:b w:val="0"/>
+                <w:sz w:val="17"/>
+              </w:rPr>
+            </w:r>
+            <w:r>
+              <w:rPr>
+                <w:b w:val="0"/>
+                <w:i/>
+                <w:sz w:val="17"/>
+              </w:rPr>
+              <w:t>Route 4: the working day of the month it reads on</w:t>
+            </w:r>
+          </w:p>
+        </w:tc>
+        <w:tc>
+          <w:tcPr>
+            <w:tcW w:type="dxa" w:w="3324"/>
+          </w:tcPr>
+          <w:p>
+            <w:r>
+              <w:rPr>
+                <w:b w:val="0"/>
+                <w:sz w:val="17"/>
+              </w:rPr>
+            </w:r>
+            <w:r>
+              <w:rPr>
+                <w:b w:val="0"/>
+                <w:i w:val="0"/>
+                <w:sz w:val="17"/>
+              </w:rPr>
+              <w:t>1st to 5th working day</w:t>
+            </w:r>
+          </w:p>
+        </w:tc>
+        <w:tc>
+          <w:tcPr>
+            <w:tcW w:type="dxa" w:w="3324"/>
+          </w:tcPr>
+          <w:p>
+            <w:r>
+              <w:rPr>
+                <w:b w:val="0"/>
+                <w:sz w:val="17"/>
+              </w:rPr>
+            </w:r>
+            <w:r>
+              <w:rPr>
+                <w:b w:val="0"/>
+                <w:i w:val="0"/>
+                <w:sz w:val="17"/>
+              </w:rPr>
+              <w:t>1st working day</w:t>
+            </w:r>
+          </w:p>
+        </w:tc>
+      </w:tr>
+      <w:tr>
+        <w:trPr>
+          <w:cantSplit/>
+        </w:trPr>
+        <w:tc>
+          <w:tcPr>
+            <w:tcW w:type="dxa" w:w="3324"/>
+          </w:tcPr>
+          <w:p>
+            <w:r>
+              <w:rPr>
+                <w:b w:val="0"/>
+                <w:sz w:val="17"/>
+              </w:rPr>
+            </w:r>
+            <w:r>
+              <w:rPr>
+                <w:b w:val="0"/>
+                <w:i/>
+                <w:sz w:val="17"/>
+              </w:rPr>
+              <w:t>Route 4: the time it reads at</w:t>
+            </w:r>
+          </w:p>
+        </w:tc>
+        <w:tc>
+          <w:tcPr>
+            <w:tcW w:type="dxa" w:w="3324"/>
+          </w:tcPr>
+          <w:p>
+            <w:r>
+              <w:rPr>
+                <w:b w:val="0"/>
+                <w:sz w:val="17"/>
+              </w:rPr>
+            </w:r>
+            <w:r>
+              <w:rPr>
+                <w:b w:val="0"/>
+                <w:i w:val="0"/>
+                <w:sz w:val="17"/>
+              </w:rPr>
+              <w:t>Every hour, 00:00 to 23:00, on the server's clock</w:t>
+            </w:r>
+          </w:p>
+        </w:tc>
+        <w:tc>
+          <w:tcPr>
+            <w:tcW w:type="dxa" w:w="3324"/>
+          </w:tcPr>
+          <w:p>
+            <w:r>
+              <w:rPr>
+                <w:b w:val="0"/>
+                <w:sz w:val="17"/>
+              </w:rPr>
+            </w:r>
+            <w:r>
+              <w:rPr>
+                <w:b w:val="0"/>
+                <w:i w:val="0"/>
+                <w:sz w:val="17"/>
+              </w:rPr>
+              <w:t>06:00</w:t>
+            </w:r>
+          </w:p>
+        </w:tc>
+      </w:tr>
+    </w:tbl>
+    <w:p/>
+    <w:p>
+      <w:pPr>
+        <w:spacing w:after="120"/>
+        <w:jc w:val="both"/>
+      </w:pPr>
+      <w:r>
+        <w:rPr>
+          <w:b w:val="0"/>
+          <w:i w:val="0"/>
+        </w:rPr>
+        <w:t xml:space="preserve">The second and third settings count only when the first is set to the working day and time set below, for example where MAIIC's month-end close or E-Banker's end-of-day runs late. Each change is proposed by one person and approved by a second, from an effective date, like every Governance Centre setting. </w:t>
+      </w:r>
+      <w:r>
+        <w:rPr>
+          <w:b/>
+          <w:i w:val="0"/>
+        </w:rPr>
+        <w:t>In UAT mode</w:t>
+      </w:r>
+      <w:r>
+        <w:rPr>
+          <w:b w:val="0"/>
+          <w:i w:val="0"/>
+        </w:rPr>
+        <w:t xml:space="preserve"> (</w:t>
+      </w:r>
+      <w:r>
+        <w:rPr>
+          <w:rFonts w:ascii="Consolas" w:hAnsi="Consolas"/>
+          <w:b w:val="0"/>
+          <w:i w:val="0"/>
+          <w:sz w:val="18"/>
+        </w:rPr>
+        <w:t>php artisan governance:uat-mode on</w:t>
+      </w:r>
+      <w:r>
+        <w:rPr>
+          <w:b w:val="0"/>
+          <w:i w:val="0"/>
+        </w:rPr>
+        <w:t xml:space="preserve">, on a non-production server only) an administrator may approve their own change, and each such approval is recorded on the self-approvals report; on production a second person is always needed. Working days are Monday to Friday: the schedule does not know Malawi's public holidays, so on a holiday it runs all the same. Until route 4 is the feed route in force (step 10) the scheduled read is refused and reads nothing. A month can always be read by hand with </w:t>
       </w:r>
       <w:r>
         <w:rPr>

</xml_diff>